<commit_message>
Add Adari interview summary, draft Gaza Project broadcaster pitch, fix docx bold bug
- Summarize Adari's (rifle company commander) interview: Litani river
  defense and the Lahav-3 tunnel destruction, cross-referenced against
  Roed Balus's higher-level account of the same operation.
- Add the Gaza Project source materials (synopsis, treatment, older
  narrative doc) and draft the broadcaster submission format
  (Brain/05-Interviews/Gaza Project/פורמט הגשה.docx) for "ימים סגולים" —
  participant names left as a placeholder pending sign-off.
- Fix summary_md_to_docx.py: inline **bold** markers were leaking as
  literal asterisks into Word output; now parsed and rendered as bold.
  Regenerated the two already-delivered files this bug affected.
- Update learning log, decisions, and essentials with this session's
  findings.
</commit_message>
<xml_diff>
--- a/Brain/05-Interviews/Season2-Lebanon/summaries/סיכום ראיון - מחט גבעתי (שם לאישור) - עיינתא ובינת גבל.docx
+++ b/Brain/05-Interviews/Season2-Lebanon/summaries/סיכום ראיון - מחט גבעתי (שם לאישור) - עיינתא ובינת גבל.docx
@@ -21,10 +21,31 @@
       </w:pPr>
       <w:r>
         <w:rPr>
+          <w:b/>
+          <w:rtl w:val="1"/>
+        </w:rPr>
+        <w:t>הערה חשובה לפני שימוש:</w:t>
+      </w:r>
+      <w:r>
+        <w:rPr>
           <w:b w:val="0"/>
           <w:rtl w:val="1"/>
         </w:rPr>
-        <w:t>**הערה חשובה לפני שימוש:** שם המרואיין אינו נאמר בתמלול עצמו. מהתוכן עולה שהדובר כנראה **מח"ט חטיבת גבעתי** ולא דניאל לוריה (שכבר מסוכם בקובץ הנפרד) — הדובר מדבר בגוף ראשון רבים על כלל החטיבה, מקבל דיווח קשר ממ"פ גדוד 52 ("יול"), ומפקד בפועל על מספר גדודים (52, 424, 607) והסיירת יחד. יש לאשר את זהותו לפני שמירת השם הסופי בכותרת הקובץ.</w:t>
+        <w:t xml:space="preserve"> שם המרואיין אינו נאמר בתמלול עצמו. מהתוכן עולה שהדובר כנראה </w:t>
+      </w:r>
+      <w:r>
+        <w:rPr>
+          <w:b/>
+          <w:rtl w:val="1"/>
+        </w:rPr>
+        <w:t>מח"ט חטיבת גבעתי</w:t>
+      </w:r>
+      <w:r>
+        <w:rPr>
+          <w:b w:val="0"/>
+          <w:rtl w:val="1"/>
+        </w:rPr>
+        <w:t xml:space="preserve"> ולא דניאל לוריה (שכבר מסוכם בקובץ הנפרד) — הדובר מדבר בגוף ראשון רבים על כלל החטיבה, מקבל דיווח קשר ממ"פ גדוד 52 ("יול"), ומפקד בפועל על מספר גדודים (52, 424, 607) והסיירת יחד. יש לאשר את זהותו לפני שמירת השם הסופי בכותרת הקובץ.</w:t>
       </w:r>
     </w:p>
     <w:p>
@@ -96,7 +117,14 @@
           <w:b w:val="0"/>
           <w:rtl w:val="1"/>
         </w:rPr>
-        <w:t>1:19-1:48 — תחושת ביטחון ומסוגלות לפני היציאה, לצד הקפדה על צניעות: **"הדבר החשוב זה לבוא צנועים לקרב... באים חזק, מבינים את השטח, מבינים את האויב, אבל... לא מזלזלים במערכת האויב שמולנו."**</w:t>
+        <w:t xml:space="preserve">1:19-1:48 — תחושת ביטחון ומסוגלות לפני היציאה, לצד הקפדה על צניעות: </w:t>
+      </w:r>
+      <w:r>
+        <w:rPr>
+          <w:b/>
+          <w:rtl w:val="1"/>
+        </w:rPr>
+        <w:t>"הדבר החשוב זה לבוא צנועים לקרב... באים חזק, מבינים את השטח, מבינים את האויב, אבל... לא מזלזלים במערכת האויב שמולנו."</w:t>
       </w:r>
     </w:p>
     <w:p>
@@ -264,7 +292,14 @@
           <w:b w:val="0"/>
           <w:rtl w:val="1"/>
         </w:rPr>
-        <w:t>5:55-6:20 — תוך כדי ההתקפה על רכס המחיצה, מ"פ גדוד 52 ("יול") מדווח בקשר שהמחבלים בורחים. זו נקודת המפנה: ההבנה שתמונת המצב שונה מהמצופה — האויב לא נערך ומתבצר כפי שדמיינו, אלא עובר מקרב הגנה לנסיגה בלתי מאורגנת. **"הפה שלו התרסק לגמרי. כל מערכי ההגנה התרסקו לגמרי על ידי ההתקפה המהירה של גדוד 52."**</w:t>
+        <w:t xml:space="preserve">5:55-6:20 — תוך כדי ההתקפה על רכס המחיצה, מ"פ גדוד 52 ("יול") מדווח בקשר שהמחבלים בורחים. זו נקודת המפנה: ההבנה שתמונת המצב שונה מהמצופה — האויב לא נערך ומתבצר כפי שדמיינו, אלא עובר מקרב הגנה לנסיגה בלתי מאורגנת. </w:t>
+      </w:r>
+      <w:r>
+        <w:rPr>
+          <w:b/>
+          <w:rtl w:val="1"/>
+        </w:rPr>
+        <w:t>"הפה שלו התרסק לגמרי. כל מערכי ההגנה התרסקו לגמרי על ידי ההתקפה המהירה של גדוד 52."</w:t>
       </w:r>
     </w:p>
     <w:p>
@@ -336,7 +371,21 @@
           <w:b w:val="0"/>
           <w:rtl w:val="1"/>
         </w:rPr>
-        <w:t>7:16-7:53 — האויב נתפס לא מוכן; מערכי ההגנה שבנה מתפרקים "בין האצבעות", והוא נותר חסר מענה וטועה. כוחותינו מנצלים את הטעויות. **באותו יום מחוסלים כ-25 מחבלים** על ידי הכוחות. פעולה על שני בתי חולים: באחד נכנסים וסוגרים עליו; בשני סוגרים בלי להיכנס, והאויב שיוצא ממנו מחוסל בכניסה. גדוד שקד מתחיל לקדוח לכיוון הקסבה באותו היום.</w:t>
+        <w:t xml:space="preserve">7:16-7:53 — האויב נתפס לא מוכן; מערכי ההגנה שבנה מתפרקים "בין האצבעות", והוא נותר חסר מענה וטועה. כוחותינו מנצלים את הטעויות. </w:t>
+      </w:r>
+      <w:r>
+        <w:rPr>
+          <w:b/>
+          <w:rtl w:val="1"/>
+        </w:rPr>
+        <w:t>באותו יום מחוסלים כ-25 מחבלים</w:t>
+      </w:r>
+      <w:r>
+        <w:rPr>
+          <w:b w:val="0"/>
+          <w:rtl w:val="1"/>
+        </w:rPr>
+        <w:t xml:space="preserve"> על ידי הכוחות. פעולה על שני בתי חולים: באחד נכנסים וסוגרים עליו; בשני סוגרים בלי להיכנס, והאויב שיוצא ממנו מחוסל בכניסה. גדוד שקד מתחיל לקדוח לכיוון הקסבה באותו היום.</w:t>
       </w:r>
     </w:p>
     <w:p>
@@ -348,7 +397,14 @@
           <w:b w:val="0"/>
           <w:rtl w:val="1"/>
         </w:rPr>
-        <w:t>7:56-8:03 — ההבנה שהמעבר הזה — מניצול ההצלחה לרדיפה — הוא היום שבו קרב בינת ג'בל הוכרע. **"זה נושא הפרק."**</w:t>
+        <w:t xml:space="preserve">7:56-8:03 — ההבנה שהמעבר הזה — מניצול ההצלחה לרדיפה — הוא היום שבו קרב בינת ג'בל הוכרע. </w:t>
+      </w:r>
+      <w:r>
+        <w:rPr>
+          <w:b/>
+          <w:rtl w:val="1"/>
+        </w:rPr>
+        <w:t>"זה נושא הפרק."</w:t>
       </w:r>
     </w:p>
     <w:p>
@@ -396,7 +452,14 @@
           <w:b w:val="0"/>
           <w:rtl w:val="1"/>
         </w:rPr>
-        <w:t>הערת דיוק:** תמלול זה הופק ע"י שירות ASR חיצוני (כמו קובץ 003 של לוריה) ולא נבדק מול השמע. מספר נקודות טעונות אימות לפני עריכה סופית:</w:t>
+        <w:t>הערת דיוק:</w:t>
+      </w:r>
+      <w:r>
+        <w:rPr>
+          <w:b/>
+          <w:rtl w:val="1"/>
+        </w:rPr>
+        <w:t xml:space="preserve"> תמלול זה הופק ע"י שירות ASR חיצוני (כמו קובץ 003 של לוריה) ולא נבדק מול השמע. מספר נקודות טעונות אימות לפני עריכה סופית:</w:t>
       </w:r>
     </w:p>
     <w:p>

</xml_diff>